<commit_message>
Restore paced head close and ship recount tooling.
The prior head ending pushed the 11–13 block to ~295 chars/min; restore
the compact close so all six shelves stay near 246–260/min after the
burden-core rewrite, regenerate the Google Docs docx exports, and add a
recount script that keeps full HH:MM keys (avoids truncating 11:00 to 11:0).

Co-authored-by: love2u2aya <love2u2aya@users.noreply.github.com>
</commit_message>
<xml_diff>
--- a/★AI関連ファイル/projects/台本_Googleドキュメント用.docx
+++ b/★AI関連ファイル/projects/台本_Googleドキュメント用.docx
@@ -1077,28 +1077,14 @@
         <w:rPr>
           <w:sz w:val="30"/>
         </w:rPr>
-        <w:t>皆さんの見すぎは、「間違っていないか」。今の正しさを何度も採点する。</w:t>
+        <w:t>皆さんの見すぎは、「間違っていないか」。今の正しさの確認。</w:t>
         <w:br/>
       </w:r>
       <w:r>
         <w:rPr>
           <w:sz w:val="30"/>
         </w:rPr>
-        <w:t>気にするほど、動かしたくなる。動かしたくなるほど、さっきまでの棚にかかりやすい。</w:t>
-        <w:br/>
-      </w:r>
-      <w:r>
-        <w:rPr>
-          <w:sz w:val="30"/>
-        </w:rPr>
-        <w:t>勧誘に乗る。定期で縛る。繰上げしたくなる。平均で安心する。</w:t>
-        <w:br/>
-      </w:r>
-      <w:r>
-        <w:rPr>
-          <w:sz w:val="30"/>
-        </w:rPr>
-        <w:t>だから今日は、正しさの確認を、動かさない。</w:t>
+        <w:t>どちらも、見るほど動きたくなるのは、同じです。</w:t>
       </w:r>
     </w:p>
     <w:p>

</xml_diff>